<commit_message>
Streamline Unit 2 (M5-M7), restructure exercises, update README
M5 (CLAUDE.md & Rules): Remove verbose sections (Importing External
Files, full CLAUDE.md tutorial), shorten .claude/rules/, move comparison
table to M6.

M6 (Skills & Commands): Reorder commands before skills, remove SKILL.md
format example and complex skill (moved to exercises), merge String
Substitutions + Dynamic Context, merge Priority + Permissions.

M7 (Subagents): Remove Agent Teams (Experimental) and Team Patterns,
merge MCP/Memory into defining subagents section, keep single
Infrastructure Specialist example.

Exercises: Restructure from flat configs/solutions into module-based
subfolders (m04-m15). Add SKILL-FORMAT-REFERENCE.md to M6 exercises.

README: Update to 15-module structure with correct titles and numbering.
Update slides, handouts, HTML, and outline for consistency.

Co-Authored-By: Claude Opus 4.6 <noreply@anthropic.com>
</commit_message>
<xml_diff>
--- a/handout/M05-M07-customization-reference.docx
+++ b/handout/M05-M07-customization-reference.docx
@@ -36,6 +36,300 @@
         <w:t xml:space="preserve">Everything you need for Modules 5, 6, and 7: project memory, reusable workflows, and delegation.</w:t>
       </w:r>
     </w:p>
+    <w:p>
+      <w:pPr>
+        <w:pStyle w:val="Heading2"/>
+        <w:spacing w:before="200"/>
+      </w:pPr>
+      <w:r>
+        <w:rPr>
+          <w:rFonts w:ascii="Calibri" w:cs="Calibri" w:eastAsia="Calibri" w:hAnsi="Calibri"/>
+          <w:b/>
+          <w:bCs/>
+          <w:color w:val="1E2761"/>
+          <w:sz w:val="22"/>
+          <w:szCs w:val="22"/>
+        </w:rPr>
+        <w:t xml:space="preserve">Commands (Quick Shortcuts)</w:t>
+      </w:r>
+    </w:p>
+    <w:p>
+      <w:pPr>
+        <w:spacing w:after="80"/>
+      </w:pPr>
+      <w:r>
+        <w:rPr>
+          <w:rFonts w:ascii="Calibri" w:cs="Calibri" w:eastAsia="Calibri" w:hAnsi="Calibri"/>
+          <w:b w:val="false"/>
+          <w:bCs w:val="false"/>
+          <w:color w:val="1E293B"/>
+          <w:sz w:val="19"/>
+          <w:szCs w:val="19"/>
+        </w:rPr>
+        <w:t xml:space="preserve">For simple prompt shortcuts, create a Markdown file in .claude/commands/. Each file becomes a /slash-command.</w:t>
+      </w:r>
+    </w:p>
+    <w:tbl>
+      <w:tblPr>
+        <w:tblW w:type="dxa" w:w="10466"/>
+        <w:tblBorders>
+          <w:top w:val="single" w:color="auto" w:sz="4"/>
+          <w:left w:val="single" w:color="auto" w:sz="4"/>
+          <w:bottom w:val="single" w:color="auto" w:sz="4"/>
+          <w:right w:val="single" w:color="auto" w:sz="4"/>
+          <w:insideH w:val="single" w:color="auto" w:sz="4"/>
+          <w:insideV w:val="single" w:color="auto" w:sz="4"/>
+        </w:tblBorders>
+      </w:tblPr>
+      <w:tblGrid>
+        <w:gridCol w:w="2800"/>
+        <w:gridCol w:w="7666"/>
+      </w:tblGrid>
+      <w:tr>
+        <w:tc>
+          <w:tcPr>
+            <w:tcW w:type="dxa" w:w="2800"/>
+            <w:tcBorders>
+              <w:top w:val="single" w:color="E2E8F0" w:sz="1"/>
+              <w:left w:val="single" w:color="E2E8F0" w:sz="1"/>
+              <w:bottom w:val="single" w:color="E2E8F0" w:sz="1"/>
+              <w:right w:val="single" w:color="E2E8F0" w:sz="1"/>
+            </w:tcBorders>
+            <w:shd w:fill="1E2761" w:val="clear"/>
+            <w:tcMar>
+              <w:top w:type="dxa" w:w="60"/>
+              <w:left w:type="dxa" w:w="100"/>
+              <w:bottom w:type="dxa" w:w="60"/>
+              <w:right w:type="dxa" w:w="100"/>
+            </w:tcMar>
+          </w:tcPr>
+          <w:p>
+            <w:r>
+              <w:rPr>
+                <w:rFonts w:ascii="Calibri" w:cs="Calibri" w:eastAsia="Calibri" w:hAnsi="Calibri"/>
+                <w:b/>
+                <w:bCs/>
+                <w:color w:val="FFFFFF"/>
+                <w:sz w:val="18"/>
+                <w:szCs w:val="18"/>
+              </w:rPr>
+              <w:t xml:space="preserve">Field</w:t>
+            </w:r>
+          </w:p>
+        </w:tc>
+        <w:tc>
+          <w:tcPr>
+            <w:tcW w:type="dxa" w:w="7666"/>
+            <w:tcBorders>
+              <w:top w:val="single" w:color="E2E8F0" w:sz="1"/>
+              <w:left w:val="single" w:color="E2E8F0" w:sz="1"/>
+              <w:bottom w:val="single" w:color="E2E8F0" w:sz="1"/>
+              <w:right w:val="single" w:color="E2E8F0" w:sz="1"/>
+            </w:tcBorders>
+            <w:shd w:fill="1E2761" w:val="clear"/>
+            <w:tcMar>
+              <w:top w:type="dxa" w:w="60"/>
+              <w:left w:type="dxa" w:w="100"/>
+              <w:bottom w:type="dxa" w:w="60"/>
+              <w:right w:type="dxa" w:w="100"/>
+            </w:tcMar>
+          </w:tcPr>
+          <w:p>
+            <w:r>
+              <w:rPr>
+                <w:rFonts w:ascii="Calibri" w:cs="Calibri" w:eastAsia="Calibri" w:hAnsi="Calibri"/>
+                <w:b/>
+                <w:bCs/>
+                <w:color w:val="FFFFFF"/>
+                <w:sz w:val="18"/>
+                <w:szCs w:val="18"/>
+              </w:rPr>
+              <w:t xml:space="preserve">Value</w:t>
+            </w:r>
+          </w:p>
+        </w:tc>
+      </w:tr>
+      <w:tr>
+        <w:tc>
+          <w:tcPr>
+            <w:tcW w:type="dxa" w:w="2800"/>
+            <w:tcBorders>
+              <w:top w:val="single" w:color="E2E8F0" w:sz="1"/>
+              <w:left w:val="single" w:color="E2E8F0" w:sz="1"/>
+              <w:bottom w:val="single" w:color="E2E8F0" w:sz="1"/>
+              <w:right w:val="single" w:color="E2E8F0" w:sz="1"/>
+            </w:tcBorders>
+            <w:tcMar>
+              <w:top w:type="dxa" w:w="60"/>
+              <w:left w:type="dxa" w:w="100"/>
+              <w:bottom w:type="dxa" w:w="60"/>
+              <w:right w:type="dxa" w:w="100"/>
+            </w:tcMar>
+          </w:tcPr>
+          <w:p>
+            <w:r>
+              <w:rPr>
+                <w:rFonts w:ascii="Calibri" w:cs="Calibri" w:eastAsia="Calibri" w:hAnsi="Calibri"/>
+                <w:b/>
+                <w:bCs/>
+                <w:color w:val="1E293B"/>
+                <w:sz w:val="18"/>
+                <w:szCs w:val="18"/>
+              </w:rPr>
+              <w:t xml:space="preserve">Location</w:t>
+            </w:r>
+          </w:p>
+        </w:tc>
+        <w:tc>
+          <w:tcPr>
+            <w:tcW w:type="dxa" w:w="7666"/>
+            <w:tcBorders>
+              <w:top w:val="single" w:color="E2E8F0" w:sz="1"/>
+              <w:left w:val="single" w:color="E2E8F0" w:sz="1"/>
+              <w:bottom w:val="single" w:color="E2E8F0" w:sz="1"/>
+              <w:right w:val="single" w:color="E2E8F0" w:sz="1"/>
+            </w:tcBorders>
+            <w:tcMar>
+              <w:top w:type="dxa" w:w="60"/>
+              <w:left w:type="dxa" w:w="100"/>
+              <w:bottom w:type="dxa" w:w="60"/>
+              <w:right w:type="dxa" w:w="100"/>
+            </w:tcMar>
+          </w:tcPr>
+          <w:p>
+            <w:r>
+              <w:rPr>
+                <w:rFonts w:ascii="Calibri" w:cs="Calibri" w:eastAsia="Calibri" w:hAnsi="Calibri"/>
+                <w:color w:val="1E293B"/>
+                <w:sz w:val="18"/>
+                <w:szCs w:val="18"/>
+              </w:rPr>
+              <w:t xml:space="preserve">.claude/commands/&lt;name&gt;.md or ~/.claude/commands/</w:t>
+            </w:r>
+          </w:p>
+        </w:tc>
+      </w:tr>
+      <w:tr>
+        <w:tc>
+          <w:tcPr>
+            <w:tcW w:type="dxa" w:w="2800"/>
+            <w:tcBorders>
+              <w:top w:val="single" w:color="E2E8F0" w:sz="1"/>
+              <w:left w:val="single" w:color="E2E8F0" w:sz="1"/>
+              <w:bottom w:val="single" w:color="E2E8F0" w:sz="1"/>
+              <w:right w:val="single" w:color="E2E8F0" w:sz="1"/>
+            </w:tcBorders>
+            <w:tcMar>
+              <w:top w:type="dxa" w:w="60"/>
+              <w:left w:type="dxa" w:w="100"/>
+              <w:bottom w:type="dxa" w:w="60"/>
+              <w:right w:type="dxa" w:w="100"/>
+            </w:tcMar>
+          </w:tcPr>
+          <w:p>
+            <w:r>
+              <w:rPr>
+                <w:rFonts w:ascii="Calibri" w:cs="Calibri" w:eastAsia="Calibri" w:hAnsi="Calibri"/>
+                <w:b/>
+                <w:bCs/>
+                <w:color w:val="1E293B"/>
+                <w:sz w:val="18"/>
+                <w:szCs w:val="18"/>
+              </w:rPr>
+              <w:t xml:space="preserve">Format</w:t>
+            </w:r>
+          </w:p>
+        </w:tc>
+        <w:tc>
+          <w:tcPr>
+            <w:tcW w:type="dxa" w:w="7666"/>
+            <w:tcBorders>
+              <w:top w:val="single" w:color="E2E8F0" w:sz="1"/>
+              <w:left w:val="single" w:color="E2E8F0" w:sz="1"/>
+              <w:bottom w:val="single" w:color="E2E8F0" w:sz="1"/>
+              <w:right w:val="single" w:color="E2E8F0" w:sz="1"/>
+            </w:tcBorders>
+            <w:tcMar>
+              <w:top w:type="dxa" w:w="60"/>
+              <w:left w:type="dxa" w:w="100"/>
+              <w:bottom w:type="dxa" w:w="60"/>
+              <w:right w:type="dxa" w:w="100"/>
+            </w:tcMar>
+          </w:tcPr>
+          <w:p>
+            <w:r>
+              <w:rPr>
+                <w:rFonts w:ascii="Calibri" w:cs="Calibri" w:eastAsia="Calibri" w:hAnsi="Calibri"/>
+                <w:color w:val="1E293B"/>
+                <w:sz w:val="18"/>
+                <w:szCs w:val="18"/>
+              </w:rPr>
+              <w:t xml:space="preserve">Markdown with optional YAML frontmatter (description field)</w:t>
+            </w:r>
+          </w:p>
+        </w:tc>
+      </w:tr>
+      <w:tr>
+        <w:tc>
+          <w:tcPr>
+            <w:tcW w:type="dxa" w:w="2800"/>
+            <w:tcBorders>
+              <w:top w:val="single" w:color="E2E8F0" w:sz="1"/>
+              <w:left w:val="single" w:color="E2E8F0" w:sz="1"/>
+              <w:bottom w:val="single" w:color="E2E8F0" w:sz="1"/>
+              <w:right w:val="single" w:color="E2E8F0" w:sz="1"/>
+            </w:tcBorders>
+            <w:tcMar>
+              <w:top w:type="dxa" w:w="60"/>
+              <w:left w:type="dxa" w:w="100"/>
+              <w:bottom w:type="dxa" w:w="60"/>
+              <w:right w:type="dxa" w:w="100"/>
+            </w:tcMar>
+          </w:tcPr>
+          <w:p>
+            <w:r>
+              <w:rPr>
+                <w:rFonts w:ascii="Calibri" w:cs="Calibri" w:eastAsia="Calibri" w:hAnsi="Calibri"/>
+                <w:b/>
+                <w:bCs/>
+                <w:color w:val="1E293B"/>
+                <w:sz w:val="18"/>
+                <w:szCs w:val="18"/>
+              </w:rPr>
+              <w:t xml:space="preserve">Usage</w:t>
+            </w:r>
+          </w:p>
+        </w:tc>
+        <w:tc>
+          <w:tcPr>
+            <w:tcW w:type="dxa" w:w="7666"/>
+            <w:tcBorders>
+              <w:top w:val="single" w:color="E2E8F0" w:sz="1"/>
+              <w:left w:val="single" w:color="E2E8F0" w:sz="1"/>
+              <w:bottom w:val="single" w:color="E2E8F0" w:sz="1"/>
+              <w:right w:val="single" w:color="E2E8F0" w:sz="1"/>
+            </w:tcBorders>
+            <w:tcMar>
+              <w:top w:type="dxa" w:w="60"/>
+              <w:left w:type="dxa" w:w="100"/>
+              <w:bottom w:type="dxa" w:w="60"/>
+              <w:right w:type="dxa" w:w="100"/>
+            </w:tcMar>
+          </w:tcPr>
+          <w:p>
+            <w:r>
+              <w:rPr>
+                <w:rFonts w:ascii="Calibri" w:cs="Calibri" w:eastAsia="Calibri" w:hAnsi="Calibri"/>
+                <w:color w:val="1E293B"/>
+                <w:sz w:val="18"/>
+                <w:szCs w:val="18"/>
+              </w:rPr>
+              <w:t xml:space="preserve">/name or /name @file.ts</w:t>
+            </w:r>
+          </w:p>
+        </w:tc>
+      </w:tr>
+    </w:tbl>
     <w:p>
       <w:pPr>
         <w:pStyle w:val="Heading2"/>

</xml_diff>